<commit_message>
Improve validation tests and project documentation
</commit_message>
<xml_diff>
--- a/PROJECT_REPORT.docx
+++ b/PROJECT_REPORT.docx
@@ -15,7 +15,7 @@
       </w:r>
     </w:p>
     <w:bookmarkEnd w:id="9"/>
-    <w:bookmarkStart w:id="46" w:name="项目仓库"/>
+    <w:bookmarkStart w:id="54" w:name="项目仓库"/>
     <w:p>
       <w:pPr>
         <w:pStyle w:val="Heading1"/>
@@ -3358,7 +3358,7 @@
         <w:t xml:space="preserve">六、遇到的问题及解决方法</w:t>
       </w:r>
     </w:p>
-    <w:bookmarkStart w:id="38" w:name="Xd720f2d216473a22aa86e727757d36fbf0cbf5a"/>
+    <w:bookmarkStart w:id="38" w:name="npm-项目名称问题"/>
     <w:p>
       <w:pPr>
         <w:pStyle w:val="Heading3"/>
@@ -3430,7 +3430,7 @@
       </w:r>
     </w:p>
     <w:bookmarkEnd w:id="38"/>
-    <w:bookmarkStart w:id="39" w:name="X93edb6e4009b16cf724d4ddab977bf2b662b0e6"/>
+    <w:bookmarkStart w:id="39" w:name="mongodb-服务未注册为-windows-服务"/>
     <w:p>
       <w:pPr>
         <w:pStyle w:val="Heading3"/>
@@ -3486,7 +3486,7 @@
       </w:r>
     </w:p>
     <w:bookmarkEnd w:id="39"/>
-    <w:bookmarkStart w:id="40" w:name="X544237eb233f54165fcb248caf17a42d9ca8f74"/>
+    <w:bookmarkStart w:id="40" w:name="自动化测试请求缺少-json-请求头"/>
     <w:p>
       <w:pPr>
         <w:pStyle w:val="Heading3"/>
@@ -3537,7 +3537,7 @@
       </w:r>
     </w:p>
     <w:bookmarkEnd w:id="40"/>
-    <w:bookmarkStart w:id="41" w:name="X73e3221c93cff9c4f198b8430ef2cd5bf70f195"/>
+    <w:bookmarkStart w:id="41" w:name="nodemon-频繁重启"/>
     <w:p>
       <w:pPr>
         <w:pStyle w:val="Heading3"/>
@@ -4281,7 +4281,708 @@
       </w:r>
     </w:p>
     <w:bookmarkEnd w:id="45"/>
+    <w:bookmarkStart w:id="53" w:name="十阶段一后续改进记录"/>
+    <w:p>
+      <w:pPr>
+        <w:pStyle w:val="Heading2"/>
+      </w:pPr>
+      <w:r>
+        <w:rPr>
+          <w:rFonts w:hint="eastAsia"/>
+        </w:rPr>
+        <w:t xml:space="preserve">十、阶段一后续改进记录</w:t>
+      </w:r>
+    </w:p>
+    <w:p>
+      <w:pPr>
+        <w:pStyle w:val="FirstParagraph"/>
+      </w:pPr>
+      <w:r>
+        <w:rPr>
+          <w:rFonts w:hint="eastAsia"/>
+        </w:rPr>
+        <w:t xml:space="preserve">在初步测试完成后，项目继续进行了以下改进：</w:t>
+      </w:r>
+    </w:p>
+    <w:bookmarkStart w:id="46" w:name="扩充登录测试"/>
+    <w:p>
+      <w:pPr>
+        <w:pStyle w:val="Heading3"/>
+      </w:pPr>
+      <w:r>
+        <w:t xml:space="preserve">1. </w:t>
+      </w:r>
+      <w:r>
+        <w:rPr>
+          <w:rFonts w:hint="eastAsia"/>
+        </w:rPr>
+        <w:t xml:space="preserve">扩充登录测试</w:t>
+      </w:r>
+    </w:p>
+    <w:p>
+      <w:pPr>
+        <w:pStyle w:val="FirstParagraph"/>
+      </w:pPr>
+      <w:r>
+        <w:rPr>
+          <w:rFonts w:hint="eastAsia"/>
+        </w:rPr>
+        <w:t xml:space="preserve">新增了正确登录和错误密码登录测试，验证：</w:t>
+      </w:r>
+    </w:p>
+    <w:p>
+      <w:pPr>
+        <w:pStyle w:val="Compact"/>
+        <w:numPr>
+          <w:ilvl w:val="0"/>
+          <w:numId w:val="1014"/>
+        </w:numPr>
+      </w:pPr>
+      <w:r>
+        <w:rPr>
+          <w:rFonts w:hint="eastAsia"/>
+        </w:rPr>
+        <w:t xml:space="preserve">正确用户名和密码可以获得</w:t>
+      </w:r>
+      <w:r>
+        <w:t xml:space="preserve"> JWT</w:t>
+      </w:r>
+    </w:p>
+    <w:p>
+      <w:pPr>
+        <w:pStyle w:val="Compact"/>
+        <w:numPr>
+          <w:ilvl w:val="0"/>
+          <w:numId w:val="1014"/>
+        </w:numPr>
+      </w:pPr>
+      <w:r>
+        <w:rPr>
+          <w:rFonts w:hint="eastAsia"/>
+        </w:rPr>
+        <w:t xml:space="preserve">错误密码返回失败</w:t>
+      </w:r>
+    </w:p>
+    <w:p>
+      <w:pPr>
+        <w:pStyle w:val="Compact"/>
+        <w:numPr>
+          <w:ilvl w:val="0"/>
+          <w:numId w:val="1014"/>
+        </w:numPr>
+      </w:pPr>
+      <w:r>
+        <w:rPr>
+          <w:rFonts w:hint="eastAsia"/>
+        </w:rPr>
+        <w:t xml:space="preserve">登录返回的用户信息与请求用户名一致</w:t>
+      </w:r>
+    </w:p>
     <w:bookmarkEnd w:id="46"/>
+    <w:bookmarkStart w:id="47" w:name="扩充权限测试"/>
+    <w:p>
+      <w:pPr>
+        <w:pStyle w:val="Heading3"/>
+      </w:pPr>
+      <w:r>
+        <w:t xml:space="preserve">2. </w:t>
+      </w:r>
+      <w:r>
+        <w:rPr>
+          <w:rFonts w:hint="eastAsia"/>
+        </w:rPr>
+        <w:t xml:space="preserve">扩充权限测试</w:t>
+      </w:r>
+    </w:p>
+    <w:p>
+      <w:pPr>
+        <w:pStyle w:val="FirstParagraph"/>
+      </w:pPr>
+      <w:r>
+        <w:rPr>
+          <w:rFonts w:hint="eastAsia"/>
+        </w:rPr>
+        <w:t xml:space="preserve">新增了越权查看统计测试，验证：</w:t>
+      </w:r>
+    </w:p>
+    <w:p>
+      <w:pPr>
+        <w:pStyle w:val="Compact"/>
+        <w:numPr>
+          <w:ilvl w:val="0"/>
+          <w:numId w:val="1015"/>
+        </w:numPr>
+      </w:pPr>
+      <w:r>
+        <w:rPr>
+          <w:rFonts w:hint="eastAsia"/>
+        </w:rPr>
+        <w:t xml:space="preserve">问卷创建者可以查看自己的统计结果</w:t>
+      </w:r>
+    </w:p>
+    <w:p>
+      <w:pPr>
+        <w:pStyle w:val="Compact"/>
+        <w:numPr>
+          <w:ilvl w:val="0"/>
+          <w:numId w:val="1015"/>
+        </w:numPr>
+      </w:pPr>
+      <w:r>
+        <w:rPr>
+          <w:rFonts w:hint="eastAsia"/>
+        </w:rPr>
+        <w:t xml:space="preserve">其他用户不能查看该问卷统计</w:t>
+      </w:r>
+    </w:p>
+    <w:bookmarkEnd w:id="47"/>
+    <w:bookmarkStart w:id="48" w:name="扩充问卷状态测试"/>
+    <w:p>
+      <w:pPr>
+        <w:pStyle w:val="Heading3"/>
+      </w:pPr>
+      <w:r>
+        <w:t xml:space="preserve">3. </w:t>
+      </w:r>
+      <w:r>
+        <w:rPr>
+          <w:rFonts w:hint="eastAsia"/>
+        </w:rPr>
+        <w:t xml:space="preserve">扩充问卷状态测试</w:t>
+      </w:r>
+    </w:p>
+    <w:p>
+      <w:pPr>
+        <w:pStyle w:val="FirstParagraph"/>
+      </w:pPr>
+      <w:r>
+        <w:rPr>
+          <w:rFonts w:hint="eastAsia"/>
+        </w:rPr>
+        <w:t xml:space="preserve">新增了以下测试：</w:t>
+      </w:r>
+    </w:p>
+    <w:p>
+      <w:pPr>
+        <w:pStyle w:val="Compact"/>
+        <w:numPr>
+          <w:ilvl w:val="0"/>
+          <w:numId w:val="1016"/>
+        </w:numPr>
+      </w:pPr>
+      <w:r>
+        <w:rPr>
+          <w:rFonts w:hint="eastAsia"/>
+        </w:rPr>
+        <w:t xml:space="preserve">非匿名问卷禁止未登录用户提交</w:t>
+      </w:r>
+    </w:p>
+    <w:p>
+      <w:pPr>
+        <w:pStyle w:val="Compact"/>
+        <w:numPr>
+          <w:ilvl w:val="0"/>
+          <w:numId w:val="1016"/>
+        </w:numPr>
+      </w:pPr>
+      <w:r>
+        <w:rPr>
+          <w:rFonts w:hint="eastAsia"/>
+        </w:rPr>
+        <w:t xml:space="preserve">关闭问卷后禁止继续提交</w:t>
+      </w:r>
+    </w:p>
+    <w:p>
+      <w:pPr>
+        <w:pStyle w:val="Compact"/>
+        <w:numPr>
+          <w:ilvl w:val="0"/>
+          <w:numId w:val="1016"/>
+        </w:numPr>
+      </w:pPr>
+      <w:r>
+        <w:rPr>
+          <w:rFonts w:hint="eastAsia"/>
+        </w:rPr>
+        <w:t xml:space="preserve">超过截止时间后禁止提交</w:t>
+      </w:r>
+    </w:p>
+    <w:bookmarkEnd w:id="48"/>
+    <w:bookmarkStart w:id="49" w:name="扩充答案校验测试"/>
+    <w:p>
+      <w:pPr>
+        <w:pStyle w:val="Heading3"/>
+      </w:pPr>
+      <w:r>
+        <w:t xml:space="preserve">4. </w:t>
+      </w:r>
+      <w:r>
+        <w:rPr>
+          <w:rFonts w:hint="eastAsia"/>
+        </w:rPr>
+        <w:t xml:space="preserve">扩充答案校验测试</w:t>
+      </w:r>
+    </w:p>
+    <w:p>
+      <w:pPr>
+        <w:pStyle w:val="FirstParagraph"/>
+      </w:pPr>
+      <w:r>
+        <w:rPr>
+          <w:rFonts w:hint="eastAsia"/>
+        </w:rPr>
+        <w:t xml:space="preserve">新增了以下测试：</w:t>
+      </w:r>
+    </w:p>
+    <w:p>
+      <w:pPr>
+        <w:pStyle w:val="Compact"/>
+        <w:numPr>
+          <w:ilvl w:val="0"/>
+          <w:numId w:val="1017"/>
+        </w:numPr>
+      </w:pPr>
+      <w:r>
+        <w:rPr>
+          <w:rFonts w:hint="eastAsia"/>
+        </w:rPr>
+        <w:t xml:space="preserve">未知题目</w:t>
+      </w:r>
+      <w:r>
+        <w:t xml:space="preserve"> ID </w:t>
+      </w:r>
+      <w:r>
+        <w:rPr>
+          <w:rFonts w:hint="eastAsia"/>
+        </w:rPr>
+        <w:t xml:space="preserve">被拒绝</w:t>
+      </w:r>
+    </w:p>
+    <w:p>
+      <w:pPr>
+        <w:pStyle w:val="Compact"/>
+        <w:numPr>
+          <w:ilvl w:val="0"/>
+          <w:numId w:val="1017"/>
+        </w:numPr>
+      </w:pPr>
+      <w:r>
+        <w:rPr>
+          <w:rFonts w:hint="eastAsia"/>
+        </w:rPr>
+        <w:t xml:space="preserve">同一道题不能重复提交答案</w:t>
+      </w:r>
+    </w:p>
+    <w:p>
+      <w:pPr>
+        <w:pStyle w:val="Compact"/>
+        <w:numPr>
+          <w:ilvl w:val="0"/>
+          <w:numId w:val="1017"/>
+        </w:numPr>
+      </w:pPr>
+      <w:r>
+        <w:rPr>
+          <w:rFonts w:hint="eastAsia"/>
+        </w:rPr>
+        <w:t xml:space="preserve">多选题最少选择数量校验</w:t>
+      </w:r>
+    </w:p>
+    <w:p>
+      <w:pPr>
+        <w:pStyle w:val="Compact"/>
+        <w:numPr>
+          <w:ilvl w:val="0"/>
+          <w:numId w:val="1017"/>
+        </w:numPr>
+      </w:pPr>
+      <w:r>
+        <w:rPr>
+          <w:rFonts w:hint="eastAsia"/>
+        </w:rPr>
+        <w:t xml:space="preserve">多选题最多选择数量校验</w:t>
+      </w:r>
+    </w:p>
+    <w:p>
+      <w:pPr>
+        <w:pStyle w:val="Compact"/>
+        <w:numPr>
+          <w:ilvl w:val="0"/>
+          <w:numId w:val="1017"/>
+        </w:numPr>
+      </w:pPr>
+      <w:r>
+        <w:rPr>
+          <w:rFonts w:hint="eastAsia"/>
+        </w:rPr>
+        <w:t xml:space="preserve">文本题最小长度校验</w:t>
+      </w:r>
+    </w:p>
+    <w:p>
+      <w:pPr>
+        <w:pStyle w:val="Compact"/>
+        <w:numPr>
+          <w:ilvl w:val="0"/>
+          <w:numId w:val="1017"/>
+        </w:numPr>
+      </w:pPr>
+      <w:r>
+        <w:rPr>
+          <w:rFonts w:hint="eastAsia"/>
+        </w:rPr>
+        <w:t xml:space="preserve">文本题最大长度校验</w:t>
+      </w:r>
+    </w:p>
+    <w:p>
+      <w:pPr>
+        <w:pStyle w:val="Compact"/>
+        <w:numPr>
+          <w:ilvl w:val="0"/>
+          <w:numId w:val="1017"/>
+        </w:numPr>
+      </w:pPr>
+      <w:r>
+        <w:rPr>
+          <w:rFonts w:hint="eastAsia"/>
+        </w:rPr>
+        <w:t xml:space="preserve">数字题最小值校验</w:t>
+      </w:r>
+    </w:p>
+    <w:p>
+      <w:pPr>
+        <w:pStyle w:val="Compact"/>
+        <w:numPr>
+          <w:ilvl w:val="0"/>
+          <w:numId w:val="1017"/>
+        </w:numPr>
+      </w:pPr>
+      <w:r>
+        <w:rPr>
+          <w:rFonts w:hint="eastAsia"/>
+        </w:rPr>
+        <w:t xml:space="preserve">数字题最大值校验</w:t>
+      </w:r>
+    </w:p>
+    <w:p>
+      <w:pPr>
+        <w:pStyle w:val="Compact"/>
+        <w:numPr>
+          <w:ilvl w:val="0"/>
+          <w:numId w:val="1017"/>
+        </w:numPr>
+      </w:pPr>
+      <w:r>
+        <w:rPr>
+          <w:rFonts w:hint="eastAsia"/>
+        </w:rPr>
+        <w:t xml:space="preserve">数字题整数校验</w:t>
+      </w:r>
+    </w:p>
+    <w:bookmarkEnd w:id="49"/>
+    <w:bookmarkStart w:id="50" w:name="补充条件跳转测试"/>
+    <w:p>
+      <w:pPr>
+        <w:pStyle w:val="Heading3"/>
+      </w:pPr>
+      <w:r>
+        <w:t xml:space="preserve">5. </w:t>
+      </w:r>
+      <w:r>
+        <w:rPr>
+          <w:rFonts w:hint="eastAsia"/>
+        </w:rPr>
+        <w:t xml:space="preserve">补充条件跳转测试</w:t>
+      </w:r>
+    </w:p>
+    <w:p>
+      <w:pPr>
+        <w:pStyle w:val="FirstParagraph"/>
+      </w:pPr>
+      <w:r>
+        <w:rPr>
+          <w:rFonts w:hint="eastAsia"/>
+        </w:rPr>
+        <w:t xml:space="preserve">新增测试验证：</w:t>
+      </w:r>
+    </w:p>
+    <w:p>
+      <w:pPr>
+        <w:pStyle w:val="Compact"/>
+        <w:numPr>
+          <w:ilvl w:val="0"/>
+          <w:numId w:val="1018"/>
+        </w:numPr>
+      </w:pPr>
+      <w:r>
+        <w:rPr>
+          <w:rFonts w:hint="eastAsia"/>
+        </w:rPr>
+        <w:t xml:space="preserve">跳转后被跳过的必答题不会阻塞提交</w:t>
+      </w:r>
+    </w:p>
+    <w:p>
+      <w:pPr>
+        <w:pStyle w:val="Compact"/>
+        <w:numPr>
+          <w:ilvl w:val="0"/>
+          <w:numId w:val="1018"/>
+        </w:numPr>
+      </w:pPr>
+      <w:r>
+        <w:rPr>
+          <w:rFonts w:hint="eastAsia"/>
+        </w:rPr>
+        <w:t xml:space="preserve">实际可达路径上的必答题仍然必须填写</w:t>
+      </w:r>
+    </w:p>
+    <w:bookmarkEnd w:id="50"/>
+    <w:bookmarkStart w:id="51" w:name="前端安全性改进"/>
+    <w:p>
+      <w:pPr>
+        <w:pStyle w:val="Heading3"/>
+      </w:pPr>
+      <w:r>
+        <w:t xml:space="preserve">6. </w:t>
+      </w:r>
+      <w:r>
+        <w:rPr>
+          <w:rFonts w:hint="eastAsia"/>
+        </w:rPr>
+        <w:t xml:space="preserve">前端安全性改进</w:t>
+      </w:r>
+    </w:p>
+    <w:p>
+      <w:pPr>
+        <w:pStyle w:val="FirstParagraph"/>
+      </w:pPr>
+      <w:r>
+        <w:rPr>
+          <w:rFonts w:hint="eastAsia"/>
+        </w:rPr>
+        <w:t xml:space="preserve">对前端动态内容进行了安全处理：</w:t>
+      </w:r>
+    </w:p>
+    <w:p>
+      <w:pPr>
+        <w:pStyle w:val="Compact"/>
+        <w:numPr>
+          <w:ilvl w:val="0"/>
+          <w:numId w:val="1019"/>
+        </w:numPr>
+      </w:pPr>
+      <w:r>
+        <w:rPr>
+          <w:rFonts w:hint="eastAsia"/>
+        </w:rPr>
+        <w:t xml:space="preserve">统计页面对问卷标题、题目标题、选项和文本答案进行</w:t>
+      </w:r>
+      <w:r>
+        <w:t xml:space="preserve"> HTML </w:t>
+      </w:r>
+      <w:r>
+        <w:rPr>
+          <w:rFonts w:hint="eastAsia"/>
+        </w:rPr>
+        <w:t xml:space="preserve">转义</w:t>
+      </w:r>
+    </w:p>
+    <w:p>
+      <w:pPr>
+        <w:pStyle w:val="Compact"/>
+        <w:numPr>
+          <w:ilvl w:val="0"/>
+          <w:numId w:val="1019"/>
+        </w:numPr>
+      </w:pPr>
+      <w:r>
+        <w:rPr>
+          <w:rFonts w:hint="eastAsia"/>
+        </w:rPr>
+        <w:t xml:space="preserve">首页问卷列表对问卷标题和访问码进行</w:t>
+      </w:r>
+      <w:r>
+        <w:t xml:space="preserve"> HTML </w:t>
+      </w:r>
+      <w:r>
+        <w:rPr>
+          <w:rFonts w:hint="eastAsia"/>
+        </w:rPr>
+        <w:t xml:space="preserve">转义</w:t>
+      </w:r>
+    </w:p>
+    <w:p>
+      <w:pPr>
+        <w:pStyle w:val="Compact"/>
+        <w:numPr>
+          <w:ilvl w:val="0"/>
+          <w:numId w:val="1019"/>
+        </w:numPr>
+      </w:pPr>
+      <w:r>
+        <w:rPr>
+          <w:rFonts w:hint="eastAsia"/>
+        </w:rPr>
+        <w:t xml:space="preserve">管理页面对题目标题和题目</w:t>
+      </w:r>
+      <w:r>
+        <w:t xml:space="preserve"> ID </w:t>
+      </w:r>
+      <w:r>
+        <w:rPr>
+          <w:rFonts w:hint="eastAsia"/>
+        </w:rPr>
+        <w:t xml:space="preserve">进行</w:t>
+      </w:r>
+      <w:r>
+        <w:t xml:space="preserve"> HTML </w:t>
+      </w:r>
+      <w:r>
+        <w:rPr>
+          <w:rFonts w:hint="eastAsia"/>
+        </w:rPr>
+        <w:t xml:space="preserve">转义</w:t>
+      </w:r>
+    </w:p>
+    <w:p>
+      <w:pPr>
+        <w:pStyle w:val="Compact"/>
+        <w:numPr>
+          <w:ilvl w:val="0"/>
+          <w:numId w:val="1019"/>
+        </w:numPr>
+      </w:pPr>
+      <w:r>
+        <w:rPr>
+          <w:rFonts w:hint="eastAsia"/>
+        </w:rPr>
+        <w:t xml:space="preserve">填写页面使用</w:t>
+      </w:r>
+      <w:r>
+        <w:t xml:space="preserve"> DOM API </w:t>
+      </w:r>
+      <w:r>
+        <w:rPr>
+          <w:rFonts w:hint="eastAsia"/>
+        </w:rPr>
+        <w:t xml:space="preserve">创建单选和多选选项，避免直接拼接用户输入</w:t>
+      </w:r>
+      <w:r>
+        <w:t xml:space="preserve"> HTML</w:t>
+      </w:r>
+    </w:p>
+    <w:bookmarkEnd w:id="51"/>
+    <w:bookmarkStart w:id="52" w:name="后端答案完整性校验"/>
+    <w:p>
+      <w:pPr>
+        <w:pStyle w:val="Heading3"/>
+      </w:pPr>
+      <w:r>
+        <w:t xml:space="preserve">7. </w:t>
+      </w:r>
+      <w:r>
+        <w:rPr>
+          <w:rFonts w:hint="eastAsia"/>
+        </w:rPr>
+        <w:t xml:space="preserve">后端答案完整性校验</w:t>
+      </w:r>
+    </w:p>
+    <w:p>
+      <w:pPr>
+        <w:pStyle w:val="FirstParagraph"/>
+      </w:pPr>
+      <w:r>
+        <w:rPr>
+          <w:rFonts w:hint="eastAsia"/>
+        </w:rPr>
+        <w:t xml:space="preserve">提交问卷时增加：</w:t>
+      </w:r>
+    </w:p>
+    <w:p>
+      <w:pPr>
+        <w:pStyle w:val="Compact"/>
+        <w:numPr>
+          <w:ilvl w:val="0"/>
+          <w:numId w:val="1020"/>
+        </w:numPr>
+      </w:pPr>
+      <w:r>
+        <w:rPr>
+          <w:rFonts w:hint="eastAsia"/>
+        </w:rPr>
+        <w:t xml:space="preserve">未知题目</w:t>
+      </w:r>
+      <w:r>
+        <w:t xml:space="preserve"> ID </w:t>
+      </w:r>
+      <w:r>
+        <w:rPr>
+          <w:rFonts w:hint="eastAsia"/>
+        </w:rPr>
+        <w:t xml:space="preserve">校验</w:t>
+      </w:r>
+    </w:p>
+    <w:p>
+      <w:pPr>
+        <w:pStyle w:val="Compact"/>
+        <w:numPr>
+          <w:ilvl w:val="0"/>
+          <w:numId w:val="1020"/>
+        </w:numPr>
+      </w:pPr>
+      <w:r>
+        <w:rPr>
+          <w:rFonts w:hint="eastAsia"/>
+        </w:rPr>
+        <w:t xml:space="preserve">同一道题重复提交校验</w:t>
+      </w:r>
+    </w:p>
+    <w:p>
+      <w:pPr>
+        <w:pStyle w:val="Compact"/>
+        <w:numPr>
+          <w:ilvl w:val="0"/>
+          <w:numId w:val="1020"/>
+        </w:numPr>
+      </w:pPr>
+      <w:r>
+        <w:rPr>
+          <w:rFonts w:hint="eastAsia"/>
+        </w:rPr>
+        <w:t xml:space="preserve">缺少题目</w:t>
+      </w:r>
+      <w:r>
+        <w:t xml:space="preserve"> ID </w:t>
+      </w:r>
+      <w:r>
+        <w:rPr>
+          <w:rFonts w:hint="eastAsia"/>
+        </w:rPr>
+        <w:t xml:space="preserve">校验</w:t>
+      </w:r>
+    </w:p>
+    <w:p>
+      <w:pPr>
+        <w:pStyle w:val="FirstParagraph"/>
+      </w:pPr>
+      <w:r>
+        <w:rPr>
+          <w:rFonts w:hint="eastAsia"/>
+        </w:rPr>
+        <w:t xml:space="preserve">这些改进使测试文档、自动化测试和实际代码行为更加一致，并降低了前端动态内容产生</w:t>
+      </w:r>
+      <w:r>
+        <w:t xml:space="preserve"> HTML </w:t>
+      </w:r>
+      <w:r>
+        <w:rPr>
+          <w:rFonts w:hint="eastAsia"/>
+        </w:rPr>
+        <w:t xml:space="preserve">注入风险的可能性。</w:t>
+      </w:r>
+    </w:p>
+    <w:bookmarkEnd w:id="52"/>
+    <w:bookmarkEnd w:id="53"/>
+    <w:bookmarkEnd w:id="54"/>
     <w:sectPr>
       <w:footnotePr>
         <w:numRestart w:val="eachSect"/>
@@ -4729,6 +5430,27 @@
     <w:lvlOverride w:ilvl="8">
       <w:startOverride w:val="1"/>
     </w:lvlOverride>
+  </w:num>
+  <w:num w:numId="1014">
+    <w:abstractNumId w:val="991"/>
+  </w:num>
+  <w:num w:numId="1015">
+    <w:abstractNumId w:val="991"/>
+  </w:num>
+  <w:num w:numId="1016">
+    <w:abstractNumId w:val="991"/>
+  </w:num>
+  <w:num w:numId="1017">
+    <w:abstractNumId w:val="991"/>
+  </w:num>
+  <w:num w:numId="1018">
+    <w:abstractNumId w:val="991"/>
+  </w:num>
+  <w:num w:numId="1019">
+    <w:abstractNumId w:val="991"/>
+  </w:num>
+  <w:num w:numId="1020">
+    <w:abstractNumId w:val="991"/>
   </w:num>
 </w:numbering>
 </file>

</xml_diff>

<commit_message>
Document browser end-to-end workflow
</commit_message>
<xml_diff>
--- a/PROJECT_REPORT.docx
+++ b/PROJECT_REPORT.docx
@@ -15,7 +15,7 @@
       </w:r>
     </w:p>
     <w:bookmarkEnd w:id="9"/>
-    <w:bookmarkStart w:id="54" w:name="项目仓库"/>
+    <w:bookmarkStart w:id="61" w:name="项目仓库"/>
     <w:p>
       <w:pPr>
         <w:pStyle w:val="Heading1"/>
@@ -3358,7 +3358,7 @@
         <w:t xml:space="preserve">六、遇到的问题及解决方法</w:t>
       </w:r>
     </w:p>
-    <w:bookmarkStart w:id="38" w:name="npm-项目名称问题"/>
+    <w:bookmarkStart w:id="38" w:name="Xd720f2d216473a22aa86e727757d36fbf0cbf5a"/>
     <w:p>
       <w:pPr>
         <w:pStyle w:val="Heading3"/>
@@ -3430,7 +3430,7 @@
       </w:r>
     </w:p>
     <w:bookmarkEnd w:id="38"/>
-    <w:bookmarkStart w:id="39" w:name="mongodb-服务未注册为-windows-服务"/>
+    <w:bookmarkStart w:id="39" w:name="X93edb6e4009b16cf724d4ddab977bf2b662b0e6"/>
     <w:p>
       <w:pPr>
         <w:pStyle w:val="Heading3"/>
@@ -3486,7 +3486,7 @@
       </w:r>
     </w:p>
     <w:bookmarkEnd w:id="39"/>
-    <w:bookmarkStart w:id="40" w:name="自动化测试请求缺少-json-请求头"/>
+    <w:bookmarkStart w:id="40" w:name="X544237eb233f54165fcb248caf17a42d9ca8f74"/>
     <w:p>
       <w:pPr>
         <w:pStyle w:val="Heading3"/>
@@ -3537,7 +3537,7 @@
       </w:r>
     </w:p>
     <w:bookmarkEnd w:id="40"/>
-    <w:bookmarkStart w:id="41" w:name="nodemon-频繁重启"/>
+    <w:bookmarkStart w:id="41" w:name="X73e3221c93cff9c4f198b8430ef2cd5bf70f195"/>
     <w:p>
       <w:pPr>
         <w:pStyle w:val="Heading3"/>
@@ -4304,7 +4304,7 @@
         <w:t xml:space="preserve">在初步测试完成后，项目继续进行了以下改进：</w:t>
       </w:r>
     </w:p>
-    <w:bookmarkStart w:id="46" w:name="扩充登录测试"/>
+    <w:bookmarkStart w:id="46" w:name="Xe5eabf3bed2f0da222d90245f7f272bb7817fab"/>
     <w:p>
       <w:pPr>
         <w:pStyle w:val="Heading3"/>
@@ -4379,7 +4379,7 @@
       </w:r>
     </w:p>
     <w:bookmarkEnd w:id="46"/>
-    <w:bookmarkStart w:id="47" w:name="扩充权限测试"/>
+    <w:bookmarkStart w:id="47" w:name="X0f804123958bf9fceec105764363d80704f4fa1"/>
     <w:p>
       <w:pPr>
         <w:pStyle w:val="Heading3"/>
@@ -4436,7 +4436,7 @@
       </w:r>
     </w:p>
     <w:bookmarkEnd w:id="47"/>
-    <w:bookmarkStart w:id="48" w:name="扩充问卷状态测试"/>
+    <w:bookmarkStart w:id="48" w:name="Xd5d2fe80263dad4025b1ae24a5c2969fe55cde3"/>
     <w:p>
       <w:pPr>
         <w:pStyle w:val="Heading3"/>
@@ -4508,7 +4508,7 @@
       </w:r>
     </w:p>
     <w:bookmarkEnd w:id="48"/>
-    <w:bookmarkStart w:id="49" w:name="扩充答案校验测试"/>
+    <w:bookmarkStart w:id="49" w:name="X487f00fc901c4b7ba84bbe8b6c673e8015ab61e"/>
     <w:p>
       <w:pPr>
         <w:pStyle w:val="Heading3"/>
@@ -4679,7 +4679,7 @@
       </w:r>
     </w:p>
     <w:bookmarkEnd w:id="49"/>
-    <w:bookmarkStart w:id="50" w:name="补充条件跳转测试"/>
+    <w:bookmarkStart w:id="50" w:name="X5a46942e7a9f283d50eebee4009b07b559cc37b"/>
     <w:p>
       <w:pPr>
         <w:pStyle w:val="Heading3"/>
@@ -4736,7 +4736,7 @@
       </w:r>
     </w:p>
     <w:bookmarkEnd w:id="50"/>
-    <w:bookmarkStart w:id="51" w:name="前端安全性改进"/>
+    <w:bookmarkStart w:id="51" w:name="X929f66fa3a045c66b24a6f88efb2f932bbd8700"/>
     <w:p>
       <w:pPr>
         <w:pStyle w:val="Heading3"/>
@@ -4871,7 +4871,7 @@
       </w:r>
     </w:p>
     <w:bookmarkEnd w:id="51"/>
-    <w:bookmarkStart w:id="52" w:name="后端答案完整性校验"/>
+    <w:bookmarkStart w:id="52" w:name="X9424b2b0d5290e62fa6aa8f1a604333ececaddb"/>
     <w:p>
       <w:pPr>
         <w:pStyle w:val="Heading3"/>
@@ -4982,7 +4982,1355 @@
     </w:p>
     <w:bookmarkEnd w:id="52"/>
     <w:bookmarkEnd w:id="53"/>
+    <w:bookmarkStart w:id="60" w:name="十一重复填写控制与浏览器自动化测试"/>
+    <w:p>
+      <w:pPr>
+        <w:pStyle w:val="Heading2"/>
+      </w:pPr>
+      <w:r>
+        <w:rPr>
+          <w:rFonts w:hint="eastAsia"/>
+        </w:rPr>
+        <w:t xml:space="preserve">十一、重复填写控制与浏览器自动化测试</w:t>
+      </w:r>
+    </w:p>
+    <w:bookmarkStart w:id="54" w:name="X093e717a627889c507c032033433599804167e5"/>
+    <w:p>
+      <w:pPr>
+        <w:pStyle w:val="Heading3"/>
+      </w:pPr>
+      <w:r>
+        <w:t xml:space="preserve">1. </w:t>
+      </w:r>
+      <w:r>
+        <w:rPr>
+          <w:rFonts w:hint="eastAsia"/>
+        </w:rPr>
+        <w:t xml:space="preserve">重复填写控制</w:t>
+      </w:r>
+    </w:p>
+    <w:p>
+      <w:pPr>
+        <w:pStyle w:val="FirstParagraph"/>
+      </w:pPr>
+      <w:r>
+        <w:rPr>
+          <w:rFonts w:hint="eastAsia"/>
+        </w:rPr>
+        <w:t xml:space="preserve">为了支持更真实的问卷业务场景，系统增加了</w:t>
+      </w:r>
+      <w:r>
+        <w:t xml:space="preserve"> </w:t>
+      </w:r>
+      <w:r>
+        <w:rPr>
+          <w:rStyle w:val="VerbatimChar"/>
+        </w:rPr>
+        <w:t xml:space="preserve">allowMultipleSubmissions</w:t>
+      </w:r>
+      <w:r>
+        <w:t xml:space="preserve"> </w:t>
+      </w:r>
+      <w:r>
+        <w:rPr>
+          <w:rFonts w:hint="eastAsia"/>
+        </w:rPr>
+        <w:t xml:space="preserve">字段：</w:t>
+      </w:r>
+    </w:p>
+    <w:p>
+      <w:pPr>
+        <w:pStyle w:val="Compact"/>
+        <w:numPr>
+          <w:ilvl w:val="0"/>
+          <w:numId w:val="1021"/>
+        </w:numPr>
+      </w:pPr>
+      <w:r>
+        <w:rPr>
+          <w:rStyle w:val="VerbatimChar"/>
+        </w:rPr>
+        <w:t xml:space="preserve">true</w:t>
+      </w:r>
+      <w:r>
+        <w:rPr>
+          <w:rFonts w:hint="eastAsia"/>
+        </w:rPr>
+        <w:t xml:space="preserve">：允许同一登录用户多次提交</w:t>
+      </w:r>
+    </w:p>
+    <w:p>
+      <w:pPr>
+        <w:pStyle w:val="Compact"/>
+        <w:numPr>
+          <w:ilvl w:val="0"/>
+          <w:numId w:val="1021"/>
+        </w:numPr>
+      </w:pPr>
+      <w:r>
+        <w:rPr>
+          <w:rStyle w:val="VerbatimChar"/>
+        </w:rPr>
+        <w:t xml:space="preserve">false</w:t>
+      </w:r>
+      <w:r>
+        <w:rPr>
+          <w:rFonts w:hint="eastAsia"/>
+        </w:rPr>
+        <w:t xml:space="preserve">：同一登录用户只能提交一次</w:t>
+      </w:r>
+    </w:p>
+    <w:p>
+      <w:pPr>
+        <w:pStyle w:val="FirstParagraph"/>
+      </w:pPr>
+      <w:r>
+        <w:rPr>
+          <w:rFonts w:hint="eastAsia"/>
+        </w:rPr>
+        <w:t xml:space="preserve">该字段保存在</w:t>
+      </w:r>
+      <w:r>
+        <w:t xml:space="preserve"> </w:t>
+      </w:r>
+      <w:r>
+        <w:rPr>
+          <w:rStyle w:val="VerbatimChar"/>
+        </w:rPr>
+        <w:t xml:space="preserve">surveys</w:t>
+      </w:r>
+      <w:r>
+        <w:t xml:space="preserve"> </w:t>
+      </w:r>
+      <w:r>
+        <w:rPr>
+          <w:rFonts w:hint="eastAsia"/>
+        </w:rPr>
+        <w:t xml:space="preserve">集合中，默认值为</w:t>
+      </w:r>
+      <w:r>
+        <w:t xml:space="preserve"> </w:t>
+      </w:r>
+      <w:r>
+        <w:rPr>
+          <w:rStyle w:val="VerbatimChar"/>
+        </w:rPr>
+        <w:t xml:space="preserve">true</w:t>
+      </w:r>
+      <w:r>
+        <w:rPr>
+          <w:rFonts w:hint="eastAsia"/>
+        </w:rPr>
+        <w:t xml:space="preserve">，保证原有问卷行为兼容。</w:t>
+      </w:r>
+    </w:p>
+    <w:p>
+      <w:pPr>
+        <w:pStyle w:val="BodyText"/>
+      </w:pPr>
+      <w:r>
+        <w:rPr>
+          <w:rFonts w:hint="eastAsia"/>
+        </w:rPr>
+        <w:t xml:space="preserve">当用户提交问卷时，后端会根据以下条件查询历史回答：</w:t>
+      </w:r>
+    </w:p>
+    <w:p>
+      <w:pPr>
+        <w:pStyle w:val="Compact"/>
+        <w:numPr>
+          <w:ilvl w:val="0"/>
+          <w:numId w:val="1022"/>
+        </w:numPr>
+      </w:pPr>
+      <w:r>
+        <w:rPr>
+          <w:rFonts w:hint="eastAsia"/>
+        </w:rPr>
+        <w:t xml:space="preserve">当前问卷</w:t>
+      </w:r>
+      <w:r>
+        <w:t xml:space="preserve"> ID</w:t>
+      </w:r>
+    </w:p>
+    <w:p>
+      <w:pPr>
+        <w:pStyle w:val="Compact"/>
+        <w:numPr>
+          <w:ilvl w:val="0"/>
+          <w:numId w:val="1022"/>
+        </w:numPr>
+      </w:pPr>
+      <w:r>
+        <w:rPr>
+          <w:rFonts w:hint="eastAsia"/>
+        </w:rPr>
+        <w:t xml:space="preserve">当前登录用户</w:t>
+      </w:r>
+      <w:r>
+        <w:t xml:space="preserve"> ID</w:t>
+      </w:r>
+    </w:p>
+    <w:p>
+      <w:pPr>
+        <w:pStyle w:val="FirstParagraph"/>
+      </w:pPr>
+      <w:r>
+        <w:rPr>
+          <w:rFonts w:hint="eastAsia"/>
+        </w:rPr>
+        <w:t xml:space="preserve">如果问卷禁止重复提交且已经存在历史回答，接口返回：</w:t>
+      </w:r>
+    </w:p>
+    <w:p>
+      <w:pPr>
+        <w:pStyle w:val="BodyText"/>
+      </w:pPr>
+      <w:r>
+        <w:t xml:space="preserve">409</w:t>
+      </w:r>
+      <w:r>
+        <w:t xml:space="preserve"> </w:t>
+      </w:r>
+      <w:r>
+        <w:rPr>
+          <w:rFonts w:hint="eastAsia"/>
+        </w:rPr>
+        <w:t xml:space="preserve">你已经提交过该问卷，不能重复提交</w:t>
+      </w:r>
+    </w:p>
+    <w:p>
+      <w:pPr>
+        <w:pStyle w:val="BodyText"/>
+      </w:pPr>
+      <w:r>
+        <w:rPr>
+          <w:rFonts w:hint="eastAsia"/>
+        </w:rPr>
+        <w:t xml:space="preserve">匿名用户暂不执行重复提交限制，因为匿名请求没有稳定的用户身份标识。</w:t>
+      </w:r>
+    </w:p>
     <w:bookmarkEnd w:id="54"/>
+    <w:bookmarkStart w:id="55" w:name="Xdf71cd1d71050a481a77c6004a8a4c706667974"/>
+    <w:p>
+      <w:pPr>
+        <w:pStyle w:val="Heading3"/>
+      </w:pPr>
+      <w:r>
+        <w:t xml:space="preserve">2. </w:t>
+      </w:r>
+      <w:r>
+        <w:rPr>
+          <w:rFonts w:hint="eastAsia"/>
+        </w:rPr>
+        <w:t xml:space="preserve">前端配置</w:t>
+      </w:r>
+    </w:p>
+    <w:p>
+      <w:pPr>
+        <w:pStyle w:val="FirstParagraph"/>
+      </w:pPr>
+      <w:r>
+        <w:rPr>
+          <w:rFonts w:hint="eastAsia"/>
+        </w:rPr>
+        <w:t xml:space="preserve">首页创建问卷时可以设置：</w:t>
+      </w:r>
+    </w:p>
+    <w:p>
+      <w:pPr>
+        <w:pStyle w:val="Compact"/>
+        <w:numPr>
+          <w:ilvl w:val="0"/>
+          <w:numId w:val="1023"/>
+        </w:numPr>
+      </w:pPr>
+      <w:r>
+        <w:rPr>
+          <w:rFonts w:hint="eastAsia"/>
+        </w:rPr>
+        <w:t xml:space="preserve">是否允许匿名填写</w:t>
+      </w:r>
+    </w:p>
+    <w:p>
+      <w:pPr>
+        <w:pStyle w:val="Compact"/>
+        <w:numPr>
+          <w:ilvl w:val="0"/>
+          <w:numId w:val="1023"/>
+        </w:numPr>
+      </w:pPr>
+      <w:r>
+        <w:rPr>
+          <w:rFonts w:hint="eastAsia"/>
+        </w:rPr>
+        <w:t xml:space="preserve">是否允许同一用户重复填写</w:t>
+      </w:r>
+    </w:p>
+    <w:p>
+      <w:pPr>
+        <w:pStyle w:val="FirstParagraph"/>
+      </w:pPr>
+      <w:r>
+        <w:rPr>
+          <w:rFonts w:hint="eastAsia"/>
+        </w:rPr>
+        <w:t xml:space="preserve">管理页面加载问卷后，可以查看和修改这两个设置。</w:t>
+      </w:r>
+    </w:p>
+    <w:bookmarkEnd w:id="55"/>
+    <w:bookmarkStart w:id="57" w:name="Xb0e7b15357dad0753d7cf623b995b4549e772a9"/>
+    <w:p>
+      <w:pPr>
+        <w:pStyle w:val="Heading3"/>
+      </w:pPr>
+      <w:r>
+        <w:t xml:space="preserve">3. </w:t>
+      </w:r>
+      <w:r>
+        <w:rPr>
+          <w:rFonts w:hint="eastAsia"/>
+        </w:rPr>
+        <w:t xml:space="preserve">浏览器端自动化测试</w:t>
+      </w:r>
+    </w:p>
+    <w:p>
+      <w:pPr>
+        <w:pStyle w:val="FirstParagraph"/>
+      </w:pPr>
+      <w:r>
+        <w:rPr>
+          <w:rFonts w:hint="eastAsia"/>
+        </w:rPr>
+        <w:t xml:space="preserve">项目增加了基于</w:t>
+      </w:r>
+      <w:r>
+        <w:t xml:space="preserve"> Playwright </w:t>
+      </w:r>
+      <w:r>
+        <w:rPr>
+          <w:rFonts w:hint="eastAsia"/>
+        </w:rPr>
+        <w:t xml:space="preserve">的浏览器端冒烟测试，文件为：</w:t>
+      </w:r>
+    </w:p>
+    <w:p>
+      <w:pPr>
+        <w:pStyle w:val="BodyText"/>
+      </w:pPr>
+      <w:r>
+        <w:t xml:space="preserve">backend/tests/browser-smoke.test.js</w:t>
+      </w:r>
+    </w:p>
+    <w:p>
+      <w:pPr>
+        <w:pStyle w:val="BodyText"/>
+      </w:pPr>
+      <w:r>
+        <w:rPr>
+          <w:rFonts w:hint="eastAsia"/>
+        </w:rPr>
+        <w:t xml:space="preserve">测试内容包括：</w:t>
+      </w:r>
+    </w:p>
+    <w:p>
+      <w:pPr>
+        <w:pStyle w:val="Compact"/>
+        <w:numPr>
+          <w:ilvl w:val="0"/>
+          <w:numId w:val="1024"/>
+        </w:numPr>
+      </w:pPr>
+      <w:r>
+        <w:rPr>
+          <w:rFonts w:hint="eastAsia"/>
+        </w:rPr>
+        <w:t xml:space="preserve">首页加载</w:t>
+      </w:r>
+    </w:p>
+    <w:p>
+      <w:pPr>
+        <w:pStyle w:val="Compact"/>
+        <w:numPr>
+          <w:ilvl w:val="0"/>
+          <w:numId w:val="1024"/>
+        </w:numPr>
+      </w:pPr>
+      <w:r>
+        <w:rPr>
+          <w:rFonts w:hint="eastAsia"/>
+        </w:rPr>
+        <w:t xml:space="preserve">填写问卷页面加载</w:t>
+      </w:r>
+    </w:p>
+    <w:p>
+      <w:pPr>
+        <w:pStyle w:val="Compact"/>
+        <w:numPr>
+          <w:ilvl w:val="0"/>
+          <w:numId w:val="1024"/>
+        </w:numPr>
+      </w:pPr>
+      <w:r>
+        <w:rPr>
+          <w:rFonts w:hint="eastAsia"/>
+        </w:rPr>
+        <w:t xml:space="preserve">管理问卷页面加载</w:t>
+      </w:r>
+    </w:p>
+    <w:p>
+      <w:pPr>
+        <w:pStyle w:val="Compact"/>
+        <w:numPr>
+          <w:ilvl w:val="0"/>
+          <w:numId w:val="1024"/>
+        </w:numPr>
+      </w:pPr>
+      <w:r>
+        <w:rPr>
+          <w:rFonts w:hint="eastAsia"/>
+        </w:rPr>
+        <w:t xml:space="preserve">统计页面加载</w:t>
+      </w:r>
+    </w:p>
+    <w:p>
+      <w:pPr>
+        <w:pStyle w:val="Compact"/>
+        <w:numPr>
+          <w:ilvl w:val="0"/>
+          <w:numId w:val="1024"/>
+        </w:numPr>
+      </w:pPr>
+      <w:r>
+        <w:rPr>
+          <w:rFonts w:hint="eastAsia"/>
+        </w:rPr>
+        <w:t xml:space="preserve">重复填写配置控件存在</w:t>
+      </w:r>
+    </w:p>
+    <w:p>
+      <w:pPr>
+        <w:pStyle w:val="Compact"/>
+        <w:numPr>
+          <w:ilvl w:val="0"/>
+          <w:numId w:val="1024"/>
+        </w:numPr>
+      </w:pPr>
+      <w:r>
+        <w:rPr>
+          <w:rFonts w:hint="eastAsia"/>
+        </w:rPr>
+        <w:t xml:space="preserve">统计页面容器存在</w:t>
+      </w:r>
+    </w:p>
+    <w:p>
+      <w:pPr>
+        <w:pStyle w:val="FirstParagraph"/>
+      </w:pPr>
+      <w:r>
+        <w:rPr>
+          <w:rFonts w:hint="eastAsia"/>
+        </w:rPr>
+        <w:t xml:space="preserve">测试命令：</w:t>
+      </w:r>
+    </w:p>
+    <w:p>
+      <w:pPr>
+        <w:pStyle w:val="BodyText"/>
+      </w:pPr>
+      <w:r>
+        <w:t xml:space="preserve">Set-Location .\frontend</w:t>
+      </w:r>
+      <w:r>
+        <w:t xml:space="preserve"> </w:t>
+      </w:r>
+      <w:r>
+        <w:t xml:space="preserve">python -m http.server 5500</w:t>
+      </w:r>
+    </w:p>
+    <w:p>
+      <w:pPr>
+        <w:pStyle w:val="BodyText"/>
+      </w:pPr>
+      <w:r>
+        <w:t xml:space="preserve">Set-Location .\backend</w:t>
+      </w:r>
+      <w:r>
+        <w:t xml:space="preserve"> </w:t>
+      </w:r>
+      <w:r>
+        <w:t xml:space="preserve">$env:FRONTEND_BASE_URL="</w:t>
+      </w:r>
+      <w:hyperlink r:id="rId56">
+        <w:r>
+          <w:rPr>
+            <w:rStyle w:val="Hyperlink"/>
+          </w:rPr>
+          <w:t xml:space="preserve">http://127.0.0.1:5500/frontend</w:t>
+        </w:r>
+      </w:hyperlink>
+      <w:r>
+        <w:t xml:space="preserve">"</w:t>
+      </w:r>
+      <w:r>
+        <w:t xml:space="preserve"> </w:t>
+      </w:r>
+      <w:r>
+        <w:t xml:space="preserve">npm run test:browser</w:t>
+      </w:r>
+    </w:p>
+    <w:p>
+      <w:pPr>
+        <w:pStyle w:val="BodyText"/>
+      </w:pPr>
+      <w:r>
+        <w:rPr>
+          <w:rFonts w:hint="eastAsia"/>
+        </w:rPr>
+        <w:t xml:space="preserve">测试结果：</w:t>
+      </w:r>
+    </w:p>
+    <w:p>
+      <w:pPr>
+        <w:pStyle w:val="BodyText"/>
+      </w:pPr>
+      <w:r>
+        <w:rPr>
+          <w:rFonts w:hint="eastAsia"/>
+        </w:rPr>
+        <w:t xml:space="preserve">浏览器端冒烟测试通过</w:t>
+      </w:r>
+    </w:p>
+    <w:bookmarkEnd w:id="57"/>
+    <w:bookmarkStart w:id="58" w:name="Xa7df782dc7cb8a25f063723069d4ce5b40bdfc2"/>
+    <w:p>
+      <w:pPr>
+        <w:pStyle w:val="Heading3"/>
+      </w:pPr>
+      <w:r>
+        <w:t xml:space="preserve">4. </w:t>
+      </w:r>
+      <w:r>
+        <w:rPr>
+          <w:rFonts w:hint="eastAsia"/>
+        </w:rPr>
+        <w:t xml:space="preserve">新增依赖</w:t>
+      </w:r>
+    </w:p>
+    <w:p>
+      <w:pPr>
+        <w:pStyle w:val="FirstParagraph"/>
+      </w:pPr>
+      <w:r>
+        <w:rPr>
+          <w:rFonts w:hint="eastAsia"/>
+        </w:rPr>
+        <w:t xml:space="preserve">浏览器测试使用：</w:t>
+      </w:r>
+    </w:p>
+    <w:p>
+      <w:pPr>
+        <w:pStyle w:val="BodyText"/>
+      </w:pPr>
+      <w:r>
+        <w:t xml:space="preserve">playwright</w:t>
+      </w:r>
+      <w:r>
+        <w:t xml:space="preserve"> </w:t>
+      </w:r>
+      <w:r>
+        <w:t xml:space="preserve">Chromium</w:t>
+      </w:r>
+    </w:p>
+    <w:p>
+      <w:pPr>
+        <w:pStyle w:val="BodyText"/>
+      </w:pPr>
+      <w:r>
+        <w:rPr>
+          <w:rFonts w:hint="eastAsia"/>
+        </w:rPr>
+        <w:t xml:space="preserve">依赖安装命令：</w:t>
+      </w:r>
+    </w:p>
+    <w:p>
+      <w:pPr>
+        <w:pStyle w:val="BodyText"/>
+      </w:pPr>
+      <w:r>
+        <w:t xml:space="preserve">npm install --save-dev playwright</w:t>
+      </w:r>
+      <w:r>
+        <w:t xml:space="preserve"> </w:t>
+      </w:r>
+      <w:r>
+        <w:t xml:space="preserve">npx playwright install chromium</w:t>
+      </w:r>
+    </w:p>
+    <w:p>
+      <w:pPr>
+        <w:pStyle w:val="BodyText"/>
+      </w:pPr>
+      <w:r>
+        <w:rPr>
+          <w:rFonts w:hint="eastAsia"/>
+        </w:rPr>
+        <w:t xml:space="preserve">通过</w:t>
+      </w:r>
+      <w:r>
+        <w:t xml:space="preserve"> API </w:t>
+      </w:r>
+      <w:r>
+        <w:rPr>
+          <w:rFonts w:hint="eastAsia"/>
+        </w:rPr>
+        <w:t xml:space="preserve">自动化测试和浏览器端自动化测试相结合，项目同时验证了后端业务逻辑和前端页面基本可用性。</w:t>
+      </w:r>
+    </w:p>
+    <w:bookmarkEnd w:id="58"/>
+    <w:bookmarkStart w:id="59" w:name="Xdf9148d178514303bde4234e553a2d7d4467992"/>
+    <w:p>
+      <w:pPr>
+        <w:pStyle w:val="Heading3"/>
+      </w:pPr>
+      <w:r>
+        <w:t xml:space="preserve">5. </w:t>
+      </w:r>
+      <w:r>
+        <w:rPr>
+          <w:rFonts w:hint="eastAsia"/>
+        </w:rPr>
+        <w:t xml:space="preserve">浏览器端端到端流程测试</w:t>
+      </w:r>
+    </w:p>
+    <w:p>
+      <w:pPr>
+        <w:pStyle w:val="FirstParagraph"/>
+      </w:pPr>
+      <w:r>
+        <w:rPr>
+          <w:rFonts w:hint="eastAsia"/>
+        </w:rPr>
+        <w:t xml:space="preserve">在浏览器冒烟测试的基础上，项目增加了完整的浏览器端端到端自动化测试，测试文件为：</w:t>
+      </w:r>
+    </w:p>
+    <w:p>
+      <w:pPr>
+        <w:pStyle w:val="BodyText"/>
+      </w:pPr>
+      <w:r>
+        <w:t xml:space="preserve">backend/tests/browser-e2e.test.js</w:t>
+      </w:r>
+    </w:p>
+    <w:p>
+      <w:pPr>
+        <w:pStyle w:val="BodyText"/>
+      </w:pPr>
+      <w:r>
+        <w:rPr>
+          <w:rFonts w:hint="eastAsia"/>
+        </w:rPr>
+        <w:t xml:space="preserve">该测试使用</w:t>
+      </w:r>
+      <w:r>
+        <w:t xml:space="preserve"> Playwright </w:t>
+      </w:r>
+      <w:r>
+        <w:rPr>
+          <w:rFonts w:hint="eastAsia"/>
+        </w:rPr>
+        <w:t xml:space="preserve">和</w:t>
+      </w:r>
+      <w:r>
+        <w:t xml:space="preserve"> </w:t>
+      </w:r>
+      <w:r>
+        <w:rPr>
+          <w:rFonts w:hint="eastAsia"/>
+        </w:rPr>
+        <w:t xml:space="preserve">Chromium，模拟真实用户完成以下完整业务流程：</w:t>
+      </w:r>
+    </w:p>
+    <w:p>
+      <w:pPr>
+        <w:pStyle w:val="BodyText"/>
+      </w:pPr>
+      <w:r>
+        <w:rPr>
+          <w:rFonts w:hint="eastAsia"/>
+        </w:rPr>
+        <w:t xml:space="preserve">注册用户</w:t>
+      </w:r>
+      <w:r>
+        <w:t xml:space="preserve"> → </w:t>
+      </w:r>
+      <w:r>
+        <w:rPr>
+          <w:rFonts w:hint="eastAsia"/>
+        </w:rPr>
+        <w:t xml:space="preserve">创建问卷</w:t>
+      </w:r>
+      <w:r>
+        <w:t xml:space="preserve"> → </w:t>
+      </w:r>
+      <w:r>
+        <w:rPr>
+          <w:rFonts w:hint="eastAsia"/>
+        </w:rPr>
+        <w:t xml:space="preserve">设置匿名填写和重复填写选项</w:t>
+      </w:r>
+      <w:r>
+        <w:t xml:space="preserve"> → </w:t>
+      </w:r>
+      <w:r>
+        <w:rPr>
+          <w:rFonts w:hint="eastAsia"/>
+        </w:rPr>
+        <w:t xml:space="preserve">添加单选题</w:t>
+      </w:r>
+      <w:r>
+        <w:t xml:space="preserve"> → </w:t>
+      </w:r>
+      <w:r>
+        <w:rPr>
+          <w:rFonts w:hint="eastAsia"/>
+        </w:rPr>
+        <w:t xml:space="preserve">发布问卷</w:t>
+      </w:r>
+      <w:r>
+        <w:t xml:space="preserve"> → </w:t>
+      </w:r>
+      <w:r>
+        <w:rPr>
+          <w:rFonts w:hint="eastAsia"/>
+        </w:rPr>
+        <w:t xml:space="preserve">打开公开填写链接</w:t>
+      </w:r>
+      <w:r>
+        <w:t xml:space="preserve"> → </w:t>
+      </w:r>
+      <w:r>
+        <w:rPr>
+          <w:rFonts w:hint="eastAsia"/>
+        </w:rPr>
+        <w:t xml:space="preserve">选择答案</w:t>
+      </w:r>
+      <w:r>
+        <w:t xml:space="preserve"> → </w:t>
+      </w:r>
+      <w:r>
+        <w:rPr>
+          <w:rFonts w:hint="eastAsia"/>
+        </w:rPr>
+        <w:t xml:space="preserve">提交问卷</w:t>
+      </w:r>
+      <w:r>
+        <w:t xml:space="preserve"> → </w:t>
+      </w:r>
+      <w:r>
+        <w:rPr>
+          <w:rFonts w:hint="eastAsia"/>
+        </w:rPr>
+        <w:t xml:space="preserve">查看问卷统计。</w:t>
+      </w:r>
+    </w:p>
+    <w:p>
+      <w:pPr>
+        <w:pStyle w:val="BodyText"/>
+      </w:pPr>
+      <w:r>
+        <w:rPr>
+          <w:rFonts w:hint="eastAsia"/>
+        </w:rPr>
+        <w:t xml:space="preserve">测试具体步骤：</w:t>
+      </w:r>
+    </w:p>
+    <w:p>
+      <w:pPr>
+        <w:pStyle w:val="Compact"/>
+        <w:numPr>
+          <w:ilvl w:val="0"/>
+          <w:numId w:val="1025"/>
+        </w:numPr>
+      </w:pPr>
+      <w:r>
+        <w:rPr>
+          <w:rFonts w:hint="eastAsia"/>
+        </w:rPr>
+        <w:t xml:space="preserve">打开首页并注册新的测试用户。</w:t>
+      </w:r>
+    </w:p>
+    <w:p>
+      <w:pPr>
+        <w:pStyle w:val="Compact"/>
+        <w:numPr>
+          <w:ilvl w:val="0"/>
+          <w:numId w:val="1025"/>
+        </w:numPr>
+      </w:pPr>
+      <w:r>
+        <w:rPr>
+          <w:rFonts w:hint="eastAsia"/>
+        </w:rPr>
+        <w:t xml:space="preserve">等待登录成功并进入问卷管理区域。</w:t>
+      </w:r>
+    </w:p>
+    <w:p>
+      <w:pPr>
+        <w:pStyle w:val="Compact"/>
+        <w:numPr>
+          <w:ilvl w:val="0"/>
+          <w:numId w:val="1025"/>
+        </w:numPr>
+      </w:pPr>
+      <w:r>
+        <w:rPr>
+          <w:rFonts w:hint="eastAsia"/>
+        </w:rPr>
+        <w:t xml:space="preserve">创建一份新的问卷。</w:t>
+      </w:r>
+    </w:p>
+    <w:p>
+      <w:pPr>
+        <w:pStyle w:val="Compact"/>
+        <w:numPr>
+          <w:ilvl w:val="0"/>
+          <w:numId w:val="1025"/>
+        </w:numPr>
+      </w:pPr>
+      <w:r>
+        <w:rPr>
+          <w:rFonts w:hint="eastAsia"/>
+        </w:rPr>
+        <w:t xml:space="preserve">设置问卷标题、说明、允许匿名填写和允许重复填写。</w:t>
+      </w:r>
+    </w:p>
+    <w:p>
+      <w:pPr>
+        <w:pStyle w:val="Compact"/>
+        <w:numPr>
+          <w:ilvl w:val="0"/>
+          <w:numId w:val="1025"/>
+        </w:numPr>
+      </w:pPr>
+      <w:r>
+        <w:rPr>
+          <w:rFonts w:hint="eastAsia"/>
+        </w:rPr>
+        <w:t xml:space="preserve">读取创建成功后的问卷</w:t>
+      </w:r>
+      <w:r>
+        <w:t xml:space="preserve"> ID。</w:t>
+      </w:r>
+    </w:p>
+    <w:p>
+      <w:pPr>
+        <w:pStyle w:val="Compact"/>
+        <w:numPr>
+          <w:ilvl w:val="0"/>
+          <w:numId w:val="1025"/>
+        </w:numPr>
+      </w:pPr>
+      <w:r>
+        <w:rPr>
+          <w:rFonts w:hint="eastAsia"/>
+        </w:rPr>
+        <w:t xml:space="preserve">进入问卷管理页面。</w:t>
+      </w:r>
+    </w:p>
+    <w:p>
+      <w:pPr>
+        <w:pStyle w:val="Compact"/>
+        <w:numPr>
+          <w:ilvl w:val="0"/>
+          <w:numId w:val="1025"/>
+        </w:numPr>
+      </w:pPr>
+      <w:r>
+        <w:rPr>
+          <w:rFonts w:hint="eastAsia"/>
+        </w:rPr>
+        <w:t xml:space="preserve">添加一道必答单选题。</w:t>
+      </w:r>
+    </w:p>
+    <w:p>
+      <w:pPr>
+        <w:pStyle w:val="Compact"/>
+        <w:numPr>
+          <w:ilvl w:val="0"/>
+          <w:numId w:val="1025"/>
+        </w:numPr>
+      </w:pPr>
+      <w:r>
+        <w:rPr>
+          <w:rFonts w:hint="eastAsia"/>
+        </w:rPr>
+        <w:t xml:space="preserve">发布问卷并读取公开访问码。</w:t>
+      </w:r>
+    </w:p>
+    <w:p>
+      <w:pPr>
+        <w:pStyle w:val="Compact"/>
+        <w:numPr>
+          <w:ilvl w:val="0"/>
+          <w:numId w:val="1025"/>
+        </w:numPr>
+      </w:pPr>
+      <w:r>
+        <w:rPr>
+          <w:rFonts w:hint="eastAsia"/>
+        </w:rPr>
+        <w:t xml:space="preserve">打开公开填写页面。</w:t>
+      </w:r>
+    </w:p>
+    <w:p>
+      <w:pPr>
+        <w:pStyle w:val="Compact"/>
+        <w:numPr>
+          <w:ilvl w:val="0"/>
+          <w:numId w:val="1025"/>
+        </w:numPr>
+      </w:pPr>
+      <w:r>
+        <w:rPr>
+          <w:rFonts w:hint="eastAsia"/>
+        </w:rPr>
+        <w:t xml:space="preserve">选择单选题答案。</w:t>
+      </w:r>
+    </w:p>
+    <w:p>
+      <w:pPr>
+        <w:pStyle w:val="Compact"/>
+        <w:numPr>
+          <w:ilvl w:val="0"/>
+          <w:numId w:val="1025"/>
+        </w:numPr>
+      </w:pPr>
+      <w:r>
+        <w:rPr>
+          <w:rFonts w:hint="eastAsia"/>
+        </w:rPr>
+        <w:t xml:space="preserve">提交问卷。</w:t>
+      </w:r>
+    </w:p>
+    <w:p>
+      <w:pPr>
+        <w:pStyle w:val="Compact"/>
+        <w:numPr>
+          <w:ilvl w:val="0"/>
+          <w:numId w:val="1025"/>
+        </w:numPr>
+      </w:pPr>
+      <w:r>
+        <w:rPr>
+          <w:rFonts w:hint="eastAsia"/>
+        </w:rPr>
+        <w:t xml:space="preserve">打开统计页面。</w:t>
+      </w:r>
+    </w:p>
+    <w:p>
+      <w:pPr>
+        <w:pStyle w:val="Compact"/>
+        <w:numPr>
+          <w:ilvl w:val="0"/>
+          <w:numId w:val="1025"/>
+        </w:numPr>
+      </w:pPr>
+      <w:r>
+        <w:rPr>
+          <w:rFonts w:hint="eastAsia"/>
+        </w:rPr>
+        <w:t xml:space="preserve">验证总回答数为</w:t>
+      </w:r>
+      <w:r>
+        <w:t xml:space="preserve"> </w:t>
+      </w:r>
+      <w:r>
+        <w:rPr>
+          <w:rFonts w:hint="eastAsia"/>
+        </w:rPr>
+        <w:t xml:space="preserve">1，并验证统计结果中包含测试题目。</w:t>
+      </w:r>
+    </w:p>
+    <w:p>
+      <w:pPr>
+        <w:pStyle w:val="FirstParagraph"/>
+      </w:pPr>
+      <w:r>
+        <w:rPr>
+          <w:rFonts w:hint="eastAsia"/>
+        </w:rPr>
+        <w:t xml:space="preserve">执行端到端测试前，需要启动</w:t>
+      </w:r>
+      <w:r>
+        <w:t xml:space="preserve"> </w:t>
+      </w:r>
+      <w:r>
+        <w:rPr>
+          <w:rFonts w:hint="eastAsia"/>
+        </w:rPr>
+        <w:t xml:space="preserve">MongoDB、后端服务和前端静态服务器。</w:t>
+      </w:r>
+    </w:p>
+    <w:p>
+      <w:pPr>
+        <w:pStyle w:val="BodyText"/>
+      </w:pPr>
+      <w:r>
+        <w:rPr>
+          <w:rFonts w:hint="eastAsia"/>
+        </w:rPr>
+        <w:t xml:space="preserve">前端静态服务器可以从项目根目录启动：</w:t>
+      </w:r>
+    </w:p>
+    <w:p>
+      <w:pPr>
+        <w:pStyle w:val="SourceCode"/>
+      </w:pPr>
+      <w:r>
+        <w:rPr>
+          <w:rStyle w:val="VerbatimChar"/>
+        </w:rPr>
+        <w:t xml:space="preserve">Set-Location </w:t>
+      </w:r>
+      <w:r>
+        <w:rPr>
+          <w:rStyle w:val="VerbatimChar"/>
+          <w:rFonts w:hint="eastAsia"/>
+        </w:rPr>
+        <w:t xml:space="preserve">"D:\Users\师旭辉\Desktop\数据库\大作业1"</w:t>
+      </w:r>
+      <w:r>
+        <w:br/>
+      </w:r>
+      <w:r>
+        <w:rPr>
+          <w:rStyle w:val="VerbatimChar"/>
+        </w:rPr>
+        <w:t xml:space="preserve">python -m http.server 5500</w:t>
+      </w:r>
+    </w:p>
+    <w:p>
+      <w:pPr>
+        <w:pStyle w:val="FirstParagraph"/>
+      </w:pPr>
+      <w:r>
+        <w:rPr>
+          <w:rFonts w:hint="eastAsia"/>
+        </w:rPr>
+        <w:t xml:space="preserve">后端服务使用</w:t>
+      </w:r>
+      <w:r>
+        <w:t xml:space="preserve"> 3000 </w:t>
+      </w:r>
+      <w:r>
+        <w:rPr>
+          <w:rFonts w:hint="eastAsia"/>
+        </w:rPr>
+        <w:t xml:space="preserve">端口：</w:t>
+      </w:r>
+    </w:p>
+    <w:p>
+      <w:pPr>
+        <w:pStyle w:val="SourceCode"/>
+      </w:pPr>
+      <w:r>
+        <w:rPr>
+          <w:rStyle w:val="VerbatimChar"/>
+        </w:rPr>
+        <w:t xml:space="preserve">Set-Location </w:t>
+      </w:r>
+      <w:r>
+        <w:rPr>
+          <w:rStyle w:val="VerbatimChar"/>
+          <w:rFonts w:hint="eastAsia"/>
+        </w:rPr>
+        <w:t xml:space="preserve">"D:\Users\师旭辉\Desktop\数据库\大作业1\backend"</w:t>
+      </w:r>
+      <w:r>
+        <w:br/>
+      </w:r>
+      <w:r>
+        <w:rPr>
+          <w:rStyle w:val="VerbatimChar"/>
+        </w:rPr>
+        <w:t xml:space="preserve">$env:PORT="3000"</w:t>
+      </w:r>
+      <w:r>
+        <w:br/>
+      </w:r>
+      <w:r>
+        <w:rPr>
+          <w:rStyle w:val="VerbatimChar"/>
+        </w:rPr>
+        <w:t xml:space="preserve">$env:MONGODB_URI="mongodb://127.0.0.1:27017/questionnaire_system"</w:t>
+      </w:r>
+      <w:r>
+        <w:br/>
+      </w:r>
+      <w:r>
+        <w:rPr>
+          <w:rStyle w:val="VerbatimChar"/>
+        </w:rPr>
+        <w:t xml:space="preserve">$env:JWT_SECRET="questionnaire-local-development-secret"</w:t>
+      </w:r>
+      <w:r>
+        <w:br/>
+      </w:r>
+      <w:r>
+        <w:rPr>
+          <w:rStyle w:val="VerbatimChar"/>
+        </w:rPr>
+        <w:t xml:space="preserve">node src/server.js</w:t>
+      </w:r>
+    </w:p>
+    <w:p>
+      <w:pPr>
+        <w:pStyle w:val="FirstParagraph"/>
+      </w:pPr>
+      <w:r>
+        <w:rPr>
+          <w:rFonts w:hint="eastAsia"/>
+        </w:rPr>
+        <w:t xml:space="preserve">另开一个</w:t>
+      </w:r>
+      <w:r>
+        <w:t xml:space="preserve"> PowerShell </w:t>
+      </w:r>
+      <w:r>
+        <w:rPr>
+          <w:rFonts w:hint="eastAsia"/>
+        </w:rPr>
+        <w:t xml:space="preserve">窗口执行端到端测试：</w:t>
+      </w:r>
+    </w:p>
+    <w:p>
+      <w:pPr>
+        <w:pStyle w:val="SourceCode"/>
+      </w:pPr>
+      <w:r>
+        <w:rPr>
+          <w:rStyle w:val="VerbatimChar"/>
+        </w:rPr>
+        <w:t xml:space="preserve">Set-Location </w:t>
+      </w:r>
+      <w:r>
+        <w:rPr>
+          <w:rStyle w:val="VerbatimChar"/>
+          <w:rFonts w:hint="eastAsia"/>
+        </w:rPr>
+        <w:t xml:space="preserve">"D:\Users\师旭辉\Desktop\数据库\大作业1\backend"</w:t>
+      </w:r>
+      <w:r>
+        <w:br/>
+      </w:r>
+      <w:r>
+        <w:rPr>
+          <w:rStyle w:val="VerbatimChar"/>
+        </w:rPr>
+        <w:t xml:space="preserve">$env:FRONTEND_BASE_URL="http://127.0.0.1:5500/frontend"</w:t>
+      </w:r>
+      <w:r>
+        <w:br/>
+      </w:r>
+      <w:r>
+        <w:rPr>
+          <w:rStyle w:val="VerbatimChar"/>
+        </w:rPr>
+        <w:t xml:space="preserve">npm run test:e2e</w:t>
+      </w:r>
+    </w:p>
+    <w:p>
+      <w:pPr>
+        <w:pStyle w:val="FirstParagraph"/>
+      </w:pPr>
+      <w:r>
+        <w:rPr>
+          <w:rFonts w:hint="eastAsia"/>
+        </w:rPr>
+        <w:t xml:space="preserve">测试成功输出：</w:t>
+      </w:r>
+    </w:p>
+    <w:p>
+      <w:pPr>
+        <w:pStyle w:val="SourceCode"/>
+      </w:pPr>
+      <w:r>
+        <w:rPr>
+          <w:rStyle w:val="VerbatimChar"/>
+          <w:rFonts w:hint="eastAsia"/>
+        </w:rPr>
+        <w:t xml:space="preserve">浏览器端到端流程测试通过</w:t>
+      </w:r>
+    </w:p>
+    <w:p>
+      <w:pPr>
+        <w:pStyle w:val="FirstParagraph"/>
+      </w:pPr>
+      <w:r>
+        <w:rPr>
+          <w:rFonts w:hint="eastAsia"/>
+        </w:rPr>
+        <w:t xml:space="preserve">该测试验证了前端页面、后端接口、JWT</w:t>
+      </w:r>
+      <w:r>
+        <w:t xml:space="preserve"> </w:t>
+      </w:r>
+      <w:r>
+        <w:rPr>
+          <w:rFonts w:hint="eastAsia"/>
+        </w:rPr>
+        <w:t xml:space="preserve">登录认证、MongoDB</w:t>
+      </w:r>
+      <w:r>
+        <w:t xml:space="preserve"> </w:t>
+      </w:r>
+      <w:r>
+        <w:rPr>
+          <w:rFonts w:hint="eastAsia"/>
+        </w:rPr>
+        <w:t xml:space="preserve">数据写入、问卷发布、公开填写、答案提交和统计查询之间的完整业务链路。</w:t>
+      </w:r>
+    </w:p>
+    <w:p>
+      <w:pPr>
+        <w:pStyle w:val="BodyText"/>
+      </w:pPr>
+      <w:r>
+        <w:rPr>
+          <w:rFonts w:hint="eastAsia"/>
+        </w:rPr>
+        <w:t xml:space="preserve">测试过程中还修复了以下问题：</w:t>
+      </w:r>
+    </w:p>
+    <w:p>
+      <w:pPr>
+        <w:pStyle w:val="Compact"/>
+        <w:numPr>
+          <w:ilvl w:val="0"/>
+          <w:numId w:val="1026"/>
+        </w:numPr>
+      </w:pPr>
+      <w:r>
+        <w:rPr>
+          <w:rFonts w:hint="eastAsia"/>
+        </w:rPr>
+        <w:t xml:space="preserve">前端静态服务器从项目根目录启动时，测试地址必须包含</w:t>
+      </w:r>
+      <w:r>
+        <w:t xml:space="preserve"> /frontend </w:t>
+      </w:r>
+      <w:r>
+        <w:rPr>
+          <w:rFonts w:hint="eastAsia"/>
+        </w:rPr>
+        <w:t xml:space="preserve">路径。</w:t>
+      </w:r>
+    </w:p>
+    <w:p>
+      <w:pPr>
+        <w:pStyle w:val="Compact"/>
+        <w:numPr>
+          <w:ilvl w:val="0"/>
+          <w:numId w:val="1026"/>
+        </w:numPr>
+      </w:pPr>
+      <w:r>
+        <w:rPr>
+          <w:rFonts w:hint="eastAsia"/>
+        </w:rPr>
+        <w:t xml:space="preserve">后端服务必须运行在</w:t>
+      </w:r>
+      <w:r>
+        <w:t xml:space="preserve"> 3000 </w:t>
+      </w:r>
+      <w:r>
+        <w:rPr>
+          <w:rFonts w:hint="eastAsia"/>
+        </w:rPr>
+        <w:t xml:space="preserve">端口，确保前端</w:t>
+      </w:r>
+      <w:r>
+        <w:t xml:space="preserve"> API </w:t>
+      </w:r>
+      <w:r>
+        <w:rPr>
+          <w:rFonts w:hint="eastAsia"/>
+        </w:rPr>
+        <w:t xml:space="preserve">地址正确。</w:t>
+      </w:r>
+    </w:p>
+    <w:p>
+      <w:pPr>
+        <w:pStyle w:val="Compact"/>
+        <w:numPr>
+          <w:ilvl w:val="0"/>
+          <w:numId w:val="1026"/>
+        </w:numPr>
+      </w:pPr>
+      <w:r>
+        <w:rPr>
+          <w:rFonts w:hint="eastAsia"/>
+        </w:rPr>
+        <w:t xml:space="preserve">创建问卷后需要等待页面重新加载和问卷列表刷新。</w:t>
+      </w:r>
+    </w:p>
+    <w:p>
+      <w:pPr>
+        <w:pStyle w:val="Compact"/>
+        <w:numPr>
+          <w:ilvl w:val="0"/>
+          <w:numId w:val="1026"/>
+        </w:numPr>
+      </w:pPr>
+      <w:r>
+        <w:rPr>
+          <w:rFonts w:hint="eastAsia"/>
+        </w:rPr>
+        <w:t xml:space="preserve">前端切换题目时会重新渲染提交按钮，自动化测试需要等待按钮真正可用。</w:t>
+      </w:r>
+    </w:p>
+    <w:p>
+      <w:pPr>
+        <w:pStyle w:val="Compact"/>
+        <w:numPr>
+          <w:ilvl w:val="0"/>
+          <w:numId w:val="1026"/>
+        </w:numPr>
+      </w:pPr>
+      <w:r>
+        <w:rPr>
+          <w:rFonts w:hint="eastAsia"/>
+        </w:rPr>
+        <w:t xml:space="preserve">提交按钮点击可能触发页面跳转，测试需要处理页面执行环境被销毁的正常情况。</w:t>
+      </w:r>
+    </w:p>
+    <w:p>
+      <w:pPr>
+        <w:pStyle w:val="FirstParagraph"/>
+      </w:pPr>
+      <w:r>
+        <w:rPr>
+          <w:rFonts w:hint="eastAsia"/>
+        </w:rPr>
+        <w:t xml:space="preserve">最终端到端测试执行结果：</w:t>
+      </w:r>
+    </w:p>
+    <w:p>
+      <w:pPr>
+        <w:pStyle w:val="SourceCode"/>
+      </w:pPr>
+      <w:r>
+        <w:rPr>
+          <w:rStyle w:val="VerbatimChar"/>
+          <w:rFonts w:hint="eastAsia"/>
+        </w:rPr>
+        <w:t xml:space="preserve">浏览器端到端流程测试通过</w:t>
+      </w:r>
+    </w:p>
+    <w:bookmarkEnd w:id="59"/>
+    <w:bookmarkEnd w:id="60"/>
+    <w:bookmarkEnd w:id="61"/>
     <w:sectPr>
       <w:footnotePr>
         <w:numRestart w:val="eachSect"/>
@@ -5450,6 +6798,51 @@
     <w:abstractNumId w:val="991"/>
   </w:num>
   <w:num w:numId="1020">
+    <w:abstractNumId w:val="991"/>
+  </w:num>
+  <w:num w:numId="1021">
+    <w:abstractNumId w:val="991"/>
+  </w:num>
+  <w:num w:numId="1022">
+    <w:abstractNumId w:val="991"/>
+  </w:num>
+  <w:num w:numId="1023">
+    <w:abstractNumId w:val="991"/>
+  </w:num>
+  <w:num w:numId="1024">
+    <w:abstractNumId w:val="991"/>
+  </w:num>
+  <w:num w:numId="1025">
+    <w:abstractNumId w:val="99411"/>
+    <w:lvlOverride w:ilvl="0">
+      <w:startOverride w:val="1"/>
+    </w:lvlOverride>
+    <w:lvlOverride w:ilvl="1">
+      <w:startOverride w:val="1"/>
+    </w:lvlOverride>
+    <w:lvlOverride w:ilvl="2">
+      <w:startOverride w:val="1"/>
+    </w:lvlOverride>
+    <w:lvlOverride w:ilvl="3">
+      <w:startOverride w:val="1"/>
+    </w:lvlOverride>
+    <w:lvlOverride w:ilvl="4">
+      <w:startOverride w:val="1"/>
+    </w:lvlOverride>
+    <w:lvlOverride w:ilvl="5">
+      <w:startOverride w:val="1"/>
+    </w:lvlOverride>
+    <w:lvlOverride w:ilvl="6">
+      <w:startOverride w:val="1"/>
+    </w:lvlOverride>
+    <w:lvlOverride w:ilvl="7">
+      <w:startOverride w:val="1"/>
+    </w:lvlOverride>
+    <w:lvlOverride w:ilvl="8">
+      <w:startOverride w:val="1"/>
+    </w:lvlOverride>
+  </w:num>
+  <w:num w:numId="1026">
     <w:abstractNumId w:val="991"/>
   </w:num>
 </w:numbering>

</xml_diff>